<commit_message>
Expand AutoCAD ACP courseware to four-day v9
</commit_message>
<xml_diff>
--- a/courseware/LP-Autodesk-ACP-AutoCAD-Design-and-Drafting.docx
+++ b/courseware/LP-Autodesk-ACP-AutoCAD-Design-and-Drafting.docx
@@ -179,7 +179,7 @@
           <w:color w:val="1F6FEB"/>
           <w:sz w:val="24"/>
         </w:rPr>
-        <w:t>Version 8.0</w:t>
+        <w:t>Version 9.0</w:t>
       </w:r>
     </w:p>
     <w:p>
@@ -525,7 +525,7 @@
               <w:rPr>
                 <w:sz w:val="19"/>
               </w:rPr>
-              <w:t>8.0</w:t>
+              <w:t>9.0</w:t>
             </w:r>
           </w:p>
         </w:tc>
@@ -553,7 +553,7 @@
               <w:rPr>
                 <w:sz w:val="19"/>
               </w:rPr>
-              <w:t>Rebuilt 32-hour schedule aligned to v8 slides, ten AutoCAD labs, detailed Learner Guide, recovered PP dataset and revised WA/PP instruments.</w:t>
+              <w:t>Expanded four-day schedule aligned to the 363-slide v9 deck, all 53 December 2025 Autodesk objectives and sixteen self-contained AutoCAD labs.</w:t>
             </w:r>
           </w:p>
         </w:tc>
@@ -704,7 +704,7 @@
         </w:rPr>
         <w:t>Day 2 - Precision editing, reusable content and annotation</w:t>
         <w:tab/>
-        <w:t>5</w:t>
+        <w:t>6</w:t>
       </w:r>
     </w:p>
     <w:p>
@@ -724,7 +724,7 @@
         </w:rPr>
         <w:t>Day 3 - Layouts, publishing and collaboration</w:t>
         <w:tab/>
-        <w:t>6</w:t>
+        <w:t>7</w:t>
       </w:r>
     </w:p>
     <w:p>
@@ -744,7 +744,7 @@
         </w:rPr>
         <w:t>Day 4 - Integrated capstone, evidence review and assessment</w:t>
         <w:tab/>
-        <w:t>6</w:t>
+        <w:t>8</w:t>
       </w:r>
     </w:p>
     <w:p>
@@ -763,7 +763,7 @@
         </w:rPr>
         <w:t>Alignment Map</w:t>
         <w:tab/>
-        <w:t>7</w:t>
+        <w:t>8</w:t>
       </w:r>
     </w:p>
     <w:p>
@@ -1072,7 +1072,7 @@
                 <w:color w:val="FFFFFF"/>
                 <w:sz w:val="17"/>
               </w:rPr>
-              <w:t>Resources</w:t>
+              <w:t>Slides</w:t>
             </w:r>
           </w:p>
         </w:tc>
@@ -1157,7 +1157,7 @@
                 <w:b w:val="0"/>
                 <w:sz w:val="16"/>
               </w:rPr>
-              <w:t>Welcome, digital attendance, trainer/learner introductions, learning outcomes, TSC and assessment briefing.</w:t>
+              <w:t>Welcome, attendance, introductions, learning outcomes, TSC, Autodesk exam map and assessment briefing.</w:t>
             </w:r>
           </w:p>
         </w:tc>
@@ -1202,7 +1202,7 @@
                 <w:b w:val="0"/>
                 <w:sz w:val="16"/>
               </w:rPr>
-              <w:t>9:30-10:30</w:t>
+              <w:t>9:30-10:45</w:t>
             </w:r>
           </w:p>
         </w:tc>
@@ -1222,7 +1222,7 @@
                 <w:b w:val="0"/>
                 <w:sz w:val="16"/>
               </w:rPr>
-              <w:t>60 min</w:t>
+              <w:t>75 min</w:t>
             </w:r>
           </w:p>
         </w:tc>
@@ -1242,7 +1242,7 @@
                 <w:b/>
                 <w:sz w:val="16"/>
               </w:rPr>
-              <w:t>Domain 1</w:t>
+              <w:t>Domain 1A</w:t>
             </w:r>
           </w:p>
         </w:tc>
@@ -1262,7 +1262,7 @@
                 <w:b w:val="0"/>
                 <w:sz w:val="16"/>
               </w:rPr>
-              <w:t>Standards, project setup, units, scale, UCS and drawing governance; concept briefing and demonstration.</w:t>
+              <w:t>Exam groups 1.1-1.2: layers, viewport overrides, filters, xref layer ownership and named UCS control.</w:t>
             </w:r>
           </w:p>
         </w:tc>
@@ -1282,7 +1282,7 @@
                 <w:b w:val="0"/>
                 <w:sz w:val="16"/>
               </w:rPr>
-              <w:t>Slides 17-21</w:t>
+              <w:t>Slides 20-45</w:t>
             </w:r>
           </w:p>
         </w:tc>
@@ -1308,7 +1308,7 @@
                 <w:b w:val="0"/>
                 <w:sz w:val="16"/>
               </w:rPr>
-              <w:t>10:30-10:45</w:t>
+              <w:t>10:45-11:00</w:t>
             </w:r>
           </w:p>
         </w:tc>
@@ -1392,7 +1392,7 @@
                 <w:b w:val="0"/>
                 <w:sz w:val="16"/>
               </w:rPr>
-              <w:t>-</w:t>
+              <w:t>—</w:t>
             </w:r>
           </w:p>
         </w:tc>
@@ -1417,7 +1417,7 @@
                 <w:b w:val="0"/>
                 <w:sz w:val="16"/>
               </w:rPr>
-              <w:t>10:45-12:15</w:t>
+              <w:t>11:00-12:00</w:t>
             </w:r>
           </w:p>
         </w:tc>
@@ -1437,7 +1437,7 @@
                 <w:b w:val="0"/>
                 <w:sz w:val="16"/>
               </w:rPr>
-              <w:t>90 min</w:t>
+              <w:t>60 min</w:t>
             </w:r>
           </w:p>
         </w:tc>
@@ -1497,7 +1497,7 @@
                 <w:b w:val="0"/>
                 <w:sz w:val="16"/>
               </w:rPr>
-              <w:t>Slide 26 · Lab 1 · LG Lab 1</w:t>
+              <w:t>Slide 100 · Lab 1 · LG Lab 1</w:t>
             </w:r>
           </w:p>
         </w:tc>
@@ -1523,7 +1523,7 @@
                 <w:b w:val="0"/>
                 <w:sz w:val="16"/>
               </w:rPr>
-              <w:t>12:15-13:15</w:t>
+              <w:t>12:00-13:00</w:t>
             </w:r>
           </w:p>
         </w:tc>
@@ -1607,7 +1607,7 @@
                 <w:b w:val="0"/>
                 <w:sz w:val="16"/>
               </w:rPr>
-              <w:t>-</w:t>
+              <w:t>—</w:t>
             </w:r>
           </w:p>
         </w:tc>
@@ -1632,7 +1632,7 @@
                 <w:b w:val="0"/>
                 <w:sz w:val="16"/>
               </w:rPr>
-              <w:t>13:15-14:15</w:t>
+              <w:t>13:00-14:15</w:t>
             </w:r>
           </w:p>
         </w:tc>
@@ -1652,7 +1652,7 @@
                 <w:b w:val="0"/>
                 <w:sz w:val="16"/>
               </w:rPr>
-              <w:t>60 min</w:t>
+              <w:t>75 min</w:t>
             </w:r>
           </w:p>
         </w:tc>
@@ -1672,7 +1672,7 @@
                 <w:b/>
                 <w:sz w:val="16"/>
               </w:rPr>
-              <w:t>Domain 1</w:t>
+              <w:t>Domain 1B</w:t>
             </w:r>
           </w:p>
         </w:tc>
@@ -1692,7 +1692,7 @@
                 <w:b w:val="0"/>
                 <w:sz w:val="16"/>
               </w:rPr>
-              <w:t>Layer governance, layer states, filters, viewport overrides, selection and drawing health.</w:t>
+              <w:t>Exam groups 1.3-1.5: properties, measurement, COUNT, interface control, audit, recovery and purge decisions.</w:t>
             </w:r>
           </w:p>
         </w:tc>
@@ -1712,7 +1712,7 @@
                 <w:b w:val="0"/>
                 <w:sz w:val="16"/>
               </w:rPr>
-              <w:t>Slides 22-25</w:t>
+              <w:t>Slides 46-80</w:t>
             </w:r>
           </w:p>
         </w:tc>
@@ -1737,7 +1737,7 @@
                 <w:b w:val="0"/>
                 <w:sz w:val="16"/>
               </w:rPr>
-              <w:t>14:15-15:15</w:t>
+              <w:t>14:15-15:00</w:t>
             </w:r>
           </w:p>
         </w:tc>
@@ -1757,7 +1757,7 @@
                 <w:b w:val="0"/>
                 <w:sz w:val="16"/>
               </w:rPr>
-              <w:t>60 min</w:t>
+              <w:t>45 min</w:t>
             </w:r>
           </w:p>
         </w:tc>
@@ -1817,7 +1817,7 @@
                 <w:b w:val="0"/>
                 <w:sz w:val="16"/>
               </w:rPr>
-              <w:t>Slide 27 · Lab 2 · LG Lab 2</w:t>
+              <w:t>Slide 101 · Lab 2 · LG Lab 2</w:t>
             </w:r>
           </w:p>
         </w:tc>
@@ -1843,7 +1843,7 @@
                 <w:b w:val="0"/>
                 <w:sz w:val="16"/>
               </w:rPr>
-              <w:t>15:15-15:30</w:t>
+              <w:t>15:00-15:15</w:t>
             </w:r>
           </w:p>
         </w:tc>
@@ -1927,7 +1927,7 @@
                 <w:b w:val="0"/>
                 <w:sz w:val="16"/>
               </w:rPr>
-              <w:t>-</w:t>
+              <w:t>—</w:t>
             </w:r>
           </w:p>
         </w:tc>
@@ -1952,7 +1952,7 @@
                 <w:b w:val="0"/>
                 <w:sz w:val="16"/>
               </w:rPr>
-              <w:t>15:30-17:15</w:t>
+              <w:t>15:15-16:15</w:t>
             </w:r>
           </w:p>
         </w:tc>
@@ -1972,7 +1972,7 @@
                 <w:b w:val="0"/>
                 <w:sz w:val="16"/>
               </w:rPr>
-              <w:t>105 min</w:t>
+              <w:t>60 min</w:t>
             </w:r>
           </w:p>
         </w:tc>
@@ -1992,7 +1992,7 @@
                 <w:b/>
                 <w:sz w:val="16"/>
               </w:rPr>
-              <w:t>Domain 3</w:t>
+              <w:t>Foundations</w:t>
             </w:r>
           </w:p>
         </w:tc>
@@ -2012,7 +2012,7 @@
                 <w:b w:val="0"/>
                 <w:sz w:val="16"/>
               </w:rPr>
-              <w:t>Advanced drawing objects, object-type selection and the precision/editing system.</w:t>
+              <w:t>Technical drawing foundations for application menus, workspaces, palettes, units, navigation, properties and layers.</w:t>
             </w:r>
           </w:p>
         </w:tc>
@@ -2032,7 +2032,112 @@
                 <w:b w:val="0"/>
                 <w:sz w:val="16"/>
               </w:rPr>
-              <w:t>Slides 39-44</w:t>
+              <w:t>Slides 81-91</w:t>
+            </w:r>
+          </w:p>
+        </w:tc>
+      </w:tr>
+      <w:tr>
+        <w:trPr>
+          <w:cantSplit/>
+        </w:trPr>
+        <w:tc>
+          <w:tcPr>
+            <w:tcW w:type="dxa" w:w="1296"/>
+            <w:vAlign w:val="center"/>
+          </w:tcPr>
+          <w:p>
+            <w:pPr>
+              <w:spacing w:after="40"/>
+            </w:pPr>
+            <w:r/>
+            <w:r>
+              <w:rPr>
+                <w:rFonts w:ascii="Arial" w:hAnsi="Arial"/>
+                <w:b w:val="0"/>
+                <w:sz w:val="16"/>
+              </w:rPr>
+              <w:t>16:15-17:15</w:t>
+            </w:r>
+          </w:p>
+        </w:tc>
+        <w:tc>
+          <w:tcPr>
+            <w:tcW w:type="dxa" w:w="936"/>
+            <w:vAlign w:val="center"/>
+          </w:tcPr>
+          <w:p>
+            <w:pPr>
+              <w:spacing w:after="40"/>
+            </w:pPr>
+            <w:r/>
+            <w:r>
+              <w:rPr>
+                <w:rFonts w:ascii="Arial" w:hAnsi="Arial"/>
+                <w:b w:val="0"/>
+                <w:sz w:val="16"/>
+              </w:rPr>
+              <w:t>60 min</w:t>
+            </w:r>
+          </w:p>
+        </w:tc>
+        <w:tc>
+          <w:tcPr>
+            <w:tcW w:type="dxa" w:w="1181"/>
+            <w:vAlign w:val="center"/>
+          </w:tcPr>
+          <w:p>
+            <w:pPr>
+              <w:spacing w:after="40"/>
+            </w:pPr>
+            <w:r/>
+            <w:r>
+              <w:rPr>
+                <w:rFonts w:ascii="Arial" w:hAnsi="Arial"/>
+                <w:b/>
+                <w:sz w:val="16"/>
+              </w:rPr>
+              <w:t>Lab 11</w:t>
+            </w:r>
+          </w:p>
+        </w:tc>
+        <w:tc>
+          <w:tcPr>
+            <w:tcW w:type="dxa" w:w="4032"/>
+            <w:vAlign w:val="center"/>
+          </w:tcPr>
+          <w:p>
+            <w:pPr>
+              <w:spacing w:after="40"/>
+            </w:pPr>
+            <w:r/>
+            <w:r>
+              <w:rPr>
+                <w:rFonts w:ascii="Arial" w:hAnsi="Arial"/>
+                <w:b w:val="0"/>
+                <w:sz w:val="16"/>
+              </w:rPr>
+              <w:t>Drawing Environment, UCS and Recovery using the selected Technical Drawing and Autodesk datasets.</w:t>
+            </w:r>
+          </w:p>
+        </w:tc>
+        <w:tc>
+          <w:tcPr>
+            <w:tcW w:type="dxa" w:w="1944"/>
+            <w:vAlign w:val="center"/>
+          </w:tcPr>
+          <w:p>
+            <w:pPr>
+              <w:spacing w:after="40"/>
+            </w:pPr>
+            <w:r/>
+            <w:r>
+              <w:rPr>
+                <w:rFonts w:ascii="Arial" w:hAnsi="Arial"/>
+                <w:b w:val="0"/>
+                <w:sz w:val="16"/>
+              </w:rPr>
+              <w:t>Slide 102 · Lab 11 · LG Lab 11</w:t>
             </w:r>
           </w:p>
         </w:tc>
@@ -2117,7 +2222,7 @@
                 <w:b w:val="0"/>
                 <w:sz w:val="16"/>
               </w:rPr>
-              <w:t>Measured-geometry critique, Day 1 retrieval practice and PM attendance.</w:t>
+              <w:t>Domain 1 evidence critique, objective traceability review and PM attendance.</w:t>
             </w:r>
           </w:p>
         </w:tc>
@@ -2137,7 +2242,7 @@
                 <w:b w:val="0"/>
                 <w:sz w:val="16"/>
               </w:rPr>
-              <w:t>Slides 41-44</w:t>
+              <w:t>Slides 93-102</w:t>
             </w:r>
           </w:p>
         </w:tc>
@@ -2152,6 +2257,11 @@
       </w:r>
       <w:r>
         <w:t>480 contact minutes (8 hours), excluding lunch and including scheduled tea breaks.</w:t>
+      </w:r>
+    </w:p>
+    <w:p>
+      <w:r>
+        <w:br w:type="page"/>
       </w:r>
     </w:p>
     <w:p>
@@ -2287,7 +2397,7 @@
                 <w:color w:val="FFFFFF"/>
                 <w:sz w:val="17"/>
               </w:rPr>
-              <w:t>Resources</w:t>
+              <w:t>Slides</w:t>
             </w:r>
           </w:p>
         </w:tc>
@@ -2417,7 +2527,7 @@
                 <w:b w:val="0"/>
                 <w:sz w:val="16"/>
               </w:rPr>
-              <w:t>9:15-10:15</w:t>
+              <w:t>9:15-10:30</w:t>
             </w:r>
           </w:p>
         </w:tc>
@@ -2437,7 +2547,7 @@
                 <w:b w:val="0"/>
                 <w:sz w:val="16"/>
               </w:rPr>
-              <w:t>60 min</w:t>
+              <w:t>75 min</w:t>
             </w:r>
           </w:p>
         </w:tc>
@@ -2457,7 +2567,7 @@
                 <w:b/>
                 <w:sz w:val="16"/>
               </w:rPr>
-              <w:t>Domain 2</w:t>
+              <w:t>Domain 2A</w:t>
             </w:r>
           </w:p>
         </w:tc>
@@ -2477,7 +2587,7 @@
                 <w:b w:val="0"/>
                 <w:sz w:val="16"/>
               </w:rPr>
-              <w:t>Stakeholder reading order, annotation styles, dimensions, hatches, revision and annotative scale.</w:t>
+              <w:t>Exam groups 2.1-2.2: annotation styles, drawing scales, assigned scales and scale-specific positions.</w:t>
             </w:r>
           </w:p>
         </w:tc>
@@ -2497,7 +2607,7 @@
                 <w:b w:val="0"/>
                 <w:sz w:val="16"/>
               </w:rPr>
-              <w:t>Slides 28-35</w:t>
+              <w:t>Slides 106-131</w:t>
             </w:r>
           </w:p>
         </w:tc>
@@ -2523,7 +2633,7 @@
                 <w:b w:val="0"/>
                 <w:sz w:val="16"/>
               </w:rPr>
-              <w:t>10:15-10:30</w:t>
+              <w:t>10:30-10:45</w:t>
             </w:r>
           </w:p>
         </w:tc>
@@ -2607,7 +2717,7 @@
                 <w:b w:val="0"/>
                 <w:sz w:val="16"/>
               </w:rPr>
-              <w:t>-</w:t>
+              <w:t>—</w:t>
             </w:r>
           </w:p>
         </w:tc>
@@ -2632,7 +2742,7 @@
                 <w:b w:val="0"/>
                 <w:sz w:val="16"/>
               </w:rPr>
-              <w:t>10:30-11:45</w:t>
+              <w:t>10:45-11:30</w:t>
             </w:r>
           </w:p>
         </w:tc>
@@ -2652,7 +2762,7 @@
                 <w:b w:val="0"/>
                 <w:sz w:val="16"/>
               </w:rPr>
-              <w:t>75 min</w:t>
+              <w:t>45 min</w:t>
             </w:r>
           </w:p>
         </w:tc>
@@ -2712,7 +2822,7 @@
                 <w:b w:val="0"/>
                 <w:sz w:val="16"/>
               </w:rPr>
-              <w:t>Slide 37 · Lab 3 · LG Lab 3</w:t>
+              <w:t>Slide 155 · Lab 3 · LG Lab 3</w:t>
             </w:r>
           </w:p>
         </w:tc>
@@ -2737,7 +2847,7 @@
                 <w:b w:val="0"/>
                 <w:sz w:val="16"/>
               </w:rPr>
-              <w:t>11:45-12:30</w:t>
+              <w:t>11:30-12:15</w:t>
             </w:r>
           </w:p>
         </w:tc>
@@ -2777,7 +2887,7 @@
                 <w:b/>
                 <w:sz w:val="16"/>
               </w:rPr>
-              <w:t>Lab 4</w:t>
+              <w:t>Domain 2B</w:t>
             </w:r>
           </w:p>
         </w:tc>
@@ -2797,7 +2907,7 @@
                 <w:b w:val="0"/>
                 <w:sz w:val="16"/>
               </w:rPr>
-              <w:t>Dimensions, Multileaders and Data Tables.</w:t>
+              <w:t>Exam group 2.3 and technical foundations: annotations, tables, hatches, multileaders and revision communication.</w:t>
             </w:r>
           </w:p>
         </w:tc>
@@ -2817,7 +2927,7 @@
                 <w:b w:val="0"/>
                 <w:sz w:val="16"/>
               </w:rPr>
-              <w:t>Slide 38 · Lab 4 · LG Lab 4</w:t>
+              <w:t>Slides 132-146</w:t>
             </w:r>
           </w:p>
         </w:tc>
@@ -2843,7 +2953,7 @@
                 <w:b w:val="0"/>
                 <w:sz w:val="16"/>
               </w:rPr>
-              <w:t>12:30-13:30</w:t>
+              <w:t>12:15-13:15</w:t>
             </w:r>
           </w:p>
         </w:tc>
@@ -2927,7 +3037,7 @@
                 <w:b w:val="0"/>
                 <w:sz w:val="16"/>
               </w:rPr>
-              <w:t>-</w:t>
+              <w:t>—</w:t>
             </w:r>
           </w:p>
         </w:tc>
@@ -2952,7 +3062,7 @@
                 <w:b w:val="0"/>
                 <w:sz w:val="16"/>
               </w:rPr>
-              <w:t>13:30-14:30</w:t>
+              <w:t>13:15-14:00</w:t>
             </w:r>
           </w:p>
         </w:tc>
@@ -2972,7 +3082,7 @@
                 <w:b w:val="0"/>
                 <w:sz w:val="16"/>
               </w:rPr>
-              <w:t>60 min</w:t>
+              <w:t>45 min</w:t>
             </w:r>
           </w:p>
         </w:tc>
@@ -2992,7 +3102,7 @@
                 <w:b/>
                 <w:sz w:val="16"/>
               </w:rPr>
-              <w:t>Domain 3</w:t>
+              <w:t>Lab 4</w:t>
             </w:r>
           </w:p>
         </w:tc>
@@ -3012,7 +3122,7 @@
                 <w:b w:val="0"/>
                 <w:sz w:val="16"/>
               </w:rPr>
-              <w:t>Precision editing, arrays, grips, regions, isometric drafting, blocks and groups.</w:t>
+              <w:t>Dimensions, Multileaders and Data Tables.</w:t>
             </w:r>
           </w:p>
         </w:tc>
@@ -3032,7 +3142,7 @@
                 <w:b w:val="0"/>
                 <w:sz w:val="16"/>
               </w:rPr>
-              <w:t>Slides 43-48</w:t>
+              <w:t>Slide 156 · Lab 4 · LG Lab 4</w:t>
             </w:r>
           </w:p>
         </w:tc>
@@ -3057,7 +3167,7 @@
                 <w:b w:val="0"/>
                 <w:sz w:val="16"/>
               </w:rPr>
-              <w:t>14:30-15:45</w:t>
+              <w:t>14:00-14:45</w:t>
             </w:r>
           </w:p>
         </w:tc>
@@ -3077,7 +3187,7 @@
                 <w:b w:val="0"/>
                 <w:sz w:val="16"/>
               </w:rPr>
-              <w:t>75 min</w:t>
+              <w:t>45 min</w:t>
             </w:r>
           </w:p>
         </w:tc>
@@ -3097,7 +3207,7 @@
                 <w:b/>
                 <w:sz w:val="16"/>
               </w:rPr>
-              <w:t>Lab 5</w:t>
+              <w:t>Lab 12</w:t>
             </w:r>
           </w:p>
         </w:tc>
@@ -3117,7 +3227,7 @@
                 <w:b w:val="0"/>
                 <w:sz w:val="16"/>
               </w:rPr>
-              <w:t>Advanced Geometry and Precision Editing.</w:t>
+              <w:t>Annotation Styles, Scales and Schedules using Technical Drawing component assets.</w:t>
             </w:r>
           </w:p>
         </w:tc>
@@ -3137,7 +3247,7 @@
                 <w:b w:val="0"/>
                 <w:sz w:val="16"/>
               </w:rPr>
-              <w:t>Slide 50 · Lab 5 · LG Lab 5</w:t>
+              <w:t>Slide 157 · Lab 12 · LG Lab 12</w:t>
             </w:r>
           </w:p>
         </w:tc>
@@ -3163,7 +3273,7 @@
                 <w:b w:val="0"/>
                 <w:sz w:val="16"/>
               </w:rPr>
-              <w:t>15:45-16:00</w:t>
+              <w:t>14:45-15:00</w:t>
             </w:r>
           </w:p>
         </w:tc>
@@ -3247,7 +3357,7 @@
                 <w:b w:val="0"/>
                 <w:sz w:val="16"/>
               </w:rPr>
-              <w:t>-</w:t>
+              <w:t>—</w:t>
             </w:r>
           </w:p>
         </w:tc>
@@ -3272,7 +3382,7 @@
                 <w:b w:val="0"/>
                 <w:sz w:val="16"/>
               </w:rPr>
-              <w:t>16:00-17:15</w:t>
+              <w:t>15:00-16:15</w:t>
             </w:r>
           </w:p>
         </w:tc>
@@ -3312,7 +3422,7 @@
                 <w:b/>
                 <w:sz w:val="16"/>
               </w:rPr>
-              <w:t>Lab 6</w:t>
+              <w:t>Domain 3A</w:t>
             </w:r>
           </w:p>
         </w:tc>
@@ -3332,7 +3442,7 @@
                 <w:b w:val="0"/>
                 <w:sz w:val="16"/>
               </w:rPr>
-              <w:t>Blocks, Attributes and Data Extraction.</w:t>
+              <w:t>Exam groups 3.1-3.2: reusable content, clipboard control, arcs, polylines, offset, boundaries and arrays.</w:t>
             </w:r>
           </w:p>
         </w:tc>
@@ -3352,7 +3462,7 @@
                 <w:b w:val="0"/>
                 <w:sz w:val="16"/>
               </w:rPr>
-              <w:t>Slide 51 · Lab 6 · LG Lab 6</w:t>
+              <w:t>Slides 161-198</w:t>
             </w:r>
           </w:p>
         </w:tc>
@@ -3377,7 +3487,7 @@
                 <w:b w:val="0"/>
                 <w:sz w:val="16"/>
               </w:rPr>
-              <w:t>17:15-18:00</w:t>
+              <w:t>16:15-17:00</w:t>
             </w:r>
           </w:p>
         </w:tc>
@@ -3417,6 +3527,216 @@
                 <w:b/>
                 <w:sz w:val="16"/>
               </w:rPr>
+              <w:t>Lab 5</w:t>
+            </w:r>
+          </w:p>
+        </w:tc>
+        <w:tc>
+          <w:tcPr>
+            <w:tcW w:type="dxa" w:w="4032"/>
+            <w:vAlign w:val="center"/>
+          </w:tcPr>
+          <w:p>
+            <w:pPr>
+              <w:spacing w:after="40"/>
+            </w:pPr>
+            <w:r/>
+            <w:r>
+              <w:rPr>
+                <w:rFonts w:ascii="Arial" w:hAnsi="Arial"/>
+                <w:b w:val="0"/>
+                <w:sz w:val="16"/>
+              </w:rPr>
+              <w:t>Advanced Geometry and Precision Editing.</w:t>
+            </w:r>
+          </w:p>
+        </w:tc>
+        <w:tc>
+          <w:tcPr>
+            <w:tcW w:type="dxa" w:w="1944"/>
+            <w:vAlign w:val="center"/>
+          </w:tcPr>
+          <w:p>
+            <w:pPr>
+              <w:spacing w:after="40"/>
+            </w:pPr>
+            <w:r/>
+            <w:r>
+              <w:rPr>
+                <w:rFonts w:ascii="Arial" w:hAnsi="Arial"/>
+                <w:b w:val="0"/>
+                <w:sz w:val="16"/>
+              </w:rPr>
+              <w:t>Slide 251 · Lab 5 · LG Lab 5</w:t>
+            </w:r>
+          </w:p>
+        </w:tc>
+      </w:tr>
+      <w:tr>
+        <w:trPr>
+          <w:cantSplit/>
+        </w:trPr>
+        <w:tc>
+          <w:tcPr>
+            <w:tcW w:type="dxa" w:w="1296"/>
+            <w:vAlign w:val="center"/>
+          </w:tcPr>
+          <w:p>
+            <w:pPr>
+              <w:spacing w:after="40"/>
+            </w:pPr>
+            <w:r/>
+            <w:r>
+              <w:rPr>
+                <w:rFonts w:ascii="Arial" w:hAnsi="Arial"/>
+                <w:b w:val="0"/>
+                <w:sz w:val="16"/>
+              </w:rPr>
+              <w:t>17:00-17:45</w:t>
+            </w:r>
+          </w:p>
+        </w:tc>
+        <w:tc>
+          <w:tcPr>
+            <w:tcW w:type="dxa" w:w="936"/>
+            <w:vAlign w:val="center"/>
+          </w:tcPr>
+          <w:p>
+            <w:pPr>
+              <w:spacing w:after="40"/>
+            </w:pPr>
+            <w:r/>
+            <w:r>
+              <w:rPr>
+                <w:rFonts w:ascii="Arial" w:hAnsi="Arial"/>
+                <w:b w:val="0"/>
+                <w:sz w:val="16"/>
+              </w:rPr>
+              <w:t>45 min</w:t>
+            </w:r>
+          </w:p>
+        </w:tc>
+        <w:tc>
+          <w:tcPr>
+            <w:tcW w:type="dxa" w:w="1181"/>
+            <w:vAlign w:val="center"/>
+          </w:tcPr>
+          <w:p>
+            <w:pPr>
+              <w:spacing w:after="40"/>
+            </w:pPr>
+            <w:r/>
+            <w:r>
+              <w:rPr>
+                <w:rFonts w:ascii="Arial" w:hAnsi="Arial"/>
+                <w:b/>
+                <w:sz w:val="16"/>
+              </w:rPr>
+              <w:t>Lab 13</w:t>
+            </w:r>
+          </w:p>
+        </w:tc>
+        <w:tc>
+          <w:tcPr>
+            <w:tcW w:type="dxa" w:w="4032"/>
+            <w:vAlign w:val="center"/>
+          </w:tcPr>
+          <w:p>
+            <w:pPr>
+              <w:spacing w:after="40"/>
+            </w:pPr>
+            <w:r/>
+            <w:r>
+              <w:rPr>
+                <w:rFonts w:ascii="Arial" w:hAnsi="Arial"/>
+                <w:b w:val="0"/>
+                <w:sz w:val="16"/>
+              </w:rPr>
+              <w:t>Coordinate Geometry and Construction Objects.</w:t>
+            </w:r>
+          </w:p>
+        </w:tc>
+        <w:tc>
+          <w:tcPr>
+            <w:tcW w:type="dxa" w:w="1944"/>
+            <w:vAlign w:val="center"/>
+          </w:tcPr>
+          <w:p>
+            <w:pPr>
+              <w:spacing w:after="40"/>
+            </w:pPr>
+            <w:r/>
+            <w:r>
+              <w:rPr>
+                <w:rFonts w:ascii="Arial" w:hAnsi="Arial"/>
+                <w:b w:val="0"/>
+                <w:sz w:val="16"/>
+              </w:rPr>
+              <w:t>Slide 253 · Lab 13 · LG Lab 13</w:t>
+            </w:r>
+          </w:p>
+        </w:tc>
+      </w:tr>
+      <w:tr>
+        <w:trPr>
+          <w:cantSplit/>
+        </w:trPr>
+        <w:tc>
+          <w:tcPr>
+            <w:tcW w:type="dxa" w:w="1296"/>
+            <w:vAlign w:val="center"/>
+          </w:tcPr>
+          <w:p>
+            <w:pPr>
+              <w:spacing w:after="40"/>
+            </w:pPr>
+            <w:r/>
+            <w:r>
+              <w:rPr>
+                <w:rFonts w:ascii="Arial" w:hAnsi="Arial"/>
+                <w:b w:val="0"/>
+                <w:sz w:val="16"/>
+              </w:rPr>
+              <w:t>17:45-18:00</w:t>
+            </w:r>
+          </w:p>
+        </w:tc>
+        <w:tc>
+          <w:tcPr>
+            <w:tcW w:type="dxa" w:w="936"/>
+            <w:vAlign w:val="center"/>
+          </w:tcPr>
+          <w:p>
+            <w:pPr>
+              <w:spacing w:after="40"/>
+            </w:pPr>
+            <w:r/>
+            <w:r>
+              <w:rPr>
+                <w:rFonts w:ascii="Arial" w:hAnsi="Arial"/>
+                <w:b w:val="0"/>
+                <w:sz w:val="16"/>
+              </w:rPr>
+              <w:t>15 min</w:t>
+            </w:r>
+          </w:p>
+        </w:tc>
+        <w:tc>
+          <w:tcPr>
+            <w:tcW w:type="dxa" w:w="1181"/>
+            <w:vAlign w:val="center"/>
+          </w:tcPr>
+          <w:p>
+            <w:pPr>
+              <w:spacing w:after="40"/>
+            </w:pPr>
+            <w:r/>
+            <w:r>
+              <w:rPr>
+                <w:rFonts w:ascii="Arial" w:hAnsi="Arial"/>
+                <w:b/>
+                <w:sz w:val="16"/>
+              </w:rPr>
               <w:t>Review</w:t>
             </w:r>
           </w:p>
@@ -3437,7 +3757,7 @@
                 <w:b w:val="0"/>
                 <w:sz w:val="16"/>
               </w:rPr>
-              <w:t>Reuse/data critique, Day 2 recap and PM attendance.</w:t>
+              <w:t>Day 2 evidence review and PM attendance.</w:t>
             </w:r>
           </w:p>
         </w:tc>
@@ -3457,7 +3777,7 @@
                 <w:b w:val="0"/>
                 <w:sz w:val="16"/>
               </w:rPr>
-              <w:t>Slides 49-51</w:t>
+              <w:t>Selected Day 2 slides</w:t>
             </w:r>
           </w:p>
         </w:tc>
@@ -3472,6 +3792,11 @@
       </w:r>
       <w:r>
         <w:t>480 contact minutes (8 hours), excluding lunch and including scheduled tea breaks.</w:t>
+      </w:r>
+    </w:p>
+    <w:p>
+      <w:r>
+        <w:br w:type="page"/>
       </w:r>
     </w:p>
     <w:p>
@@ -3607,7 +3932,7 @@
                 <w:color w:val="FFFFFF"/>
                 <w:sz w:val="17"/>
               </w:rPr>
-              <w:t>Resources</w:t>
+              <w:t>Slides</w:t>
             </w:r>
           </w:p>
         </w:tc>
@@ -3737,7 +4062,7 @@
                 <w:b w:val="0"/>
                 <w:sz w:val="16"/>
               </w:rPr>
-              <w:t>9:15-10:15</w:t>
+              <w:t>9:15-10:30</w:t>
             </w:r>
           </w:p>
         </w:tc>
@@ -3757,7 +4082,7 @@
                 <w:b w:val="0"/>
                 <w:sz w:val="16"/>
               </w:rPr>
-              <w:t>60 min</w:t>
+              <w:t>75 min</w:t>
             </w:r>
           </w:p>
         </w:tc>
@@ -3777,7 +4102,7 @@
                 <w:b/>
                 <w:sz w:val="16"/>
               </w:rPr>
-              <w:t>Domain 4</w:t>
+              <w:t>Domain 3B</w:t>
             </w:r>
           </w:p>
         </w:tc>
@@ -3797,7 +4122,7 @@
                 <w:b w:val="0"/>
                 <w:sz w:val="16"/>
               </w:rPr>
-              <w:t>Model/paper space, layouts, page setups, viewports, scales and output quality.</w:t>
+              <w:t>Exam groups 3.3-3.4 and foundations: grips, dynamic input, snaps, coordinates and controlled modification.</w:t>
             </w:r>
           </w:p>
         </w:tc>
@@ -3817,7 +4142,7 @@
                 <w:b w:val="0"/>
                 <w:sz w:val="16"/>
               </w:rPr>
-              <w:t>Slides 52-57</w:t>
+              <w:t>Slides 199-237</w:t>
             </w:r>
           </w:p>
         </w:tc>
@@ -3843,7 +4168,7 @@
                 <w:b w:val="0"/>
                 <w:sz w:val="16"/>
               </w:rPr>
-              <w:t>10:15-10:30</w:t>
+              <w:t>10:30-10:45</w:t>
             </w:r>
           </w:p>
         </w:tc>
@@ -3927,7 +4252,7 @@
                 <w:b w:val="0"/>
                 <w:sz w:val="16"/>
               </w:rPr>
-              <w:t>-</w:t>
+              <w:t>—</w:t>
             </w:r>
           </w:p>
         </w:tc>
@@ -3952,7 +4277,7 @@
                 <w:b w:val="0"/>
                 <w:sz w:val="16"/>
               </w:rPr>
-              <w:t>10:30-12:00</w:t>
+              <w:t>10:45-11:30</w:t>
             </w:r>
           </w:p>
         </w:tc>
@@ -3972,7 +4297,7 @@
                 <w:b w:val="0"/>
                 <w:sz w:val="16"/>
               </w:rPr>
-              <w:t>90 min</w:t>
+              <w:t>45 min</w:t>
             </w:r>
           </w:p>
         </w:tc>
@@ -3992,7 +4317,7 @@
                 <w:b/>
                 <w:sz w:val="16"/>
               </w:rPr>
-              <w:t>Lab 7</w:t>
+              <w:t>Lab 6</w:t>
             </w:r>
           </w:p>
         </w:tc>
@@ -4012,7 +4337,7 @@
                 <w:b w:val="0"/>
                 <w:sz w:val="16"/>
               </w:rPr>
-              <w:t>Layouts, Viewports and Page Setups using the recovered sink dataset.</w:t>
+              <w:t>Blocks, Attributes and Data Extraction.</w:t>
             </w:r>
           </w:p>
         </w:tc>
@@ -4032,7 +4357,7 @@
                 <w:b w:val="0"/>
                 <w:sz w:val="16"/>
               </w:rPr>
-              <w:t>Slide 60 · Lab 7 · LG Lab 7</w:t>
+              <w:t>Slide 252 · Lab 6 · LG Lab 6</w:t>
             </w:r>
           </w:p>
         </w:tc>
@@ -4057,7 +4382,7 @@
                 <w:b w:val="0"/>
                 <w:sz w:val="16"/>
               </w:rPr>
-              <w:t>12:00-13:00</w:t>
+              <w:t>11:30-12:15</w:t>
             </w:r>
           </w:p>
         </w:tc>
@@ -4077,7 +4402,7 @@
                 <w:b w:val="0"/>
                 <w:sz w:val="16"/>
               </w:rPr>
-              <w:t>60 min</w:t>
+              <w:t>45 min</w:t>
             </w:r>
           </w:p>
         </w:tc>
@@ -4097,7 +4422,7 @@
                 <w:b/>
                 <w:sz w:val="16"/>
               </w:rPr>
-              <w:t>Lab 8</w:t>
+              <w:t>Lab 14</w:t>
             </w:r>
           </w:p>
         </w:tc>
@@ -4117,7 +4442,7 @@
                 <w:b w:val="0"/>
                 <w:sz w:val="16"/>
               </w:rPr>
-              <w:t>Publish, Plot and eTransmit.</w:t>
+              <w:t>Associative Arrays and Grip-Based Revision.</w:t>
             </w:r>
           </w:p>
         </w:tc>
@@ -4137,7 +4462,7 @@
                 <w:b w:val="0"/>
                 <w:sz w:val="16"/>
               </w:rPr>
-              <w:t>Slide 61 · Lab 8 · LG Lab 8</w:t>
+              <w:t>Slide 254 · Lab 14 · LG Lab 14</w:t>
             </w:r>
           </w:p>
         </w:tc>
@@ -4163,7 +4488,7 @@
                 <w:b w:val="0"/>
                 <w:sz w:val="16"/>
               </w:rPr>
-              <w:t>13:00-14:00</w:t>
+              <w:t>12:15-13:15</w:t>
             </w:r>
           </w:p>
         </w:tc>
@@ -4247,7 +4572,7 @@
                 <w:b w:val="0"/>
                 <w:sz w:val="16"/>
               </w:rPr>
-              <w:t>-</w:t>
+              <w:t>—</w:t>
             </w:r>
           </w:p>
         </w:tc>
@@ -4272,7 +4597,7 @@
                 <w:b w:val="0"/>
                 <w:sz w:val="16"/>
               </w:rPr>
-              <w:t>14:00-15:00</w:t>
+              <w:t>13:15-14:30</w:t>
             </w:r>
           </w:p>
         </w:tc>
@@ -4292,7 +4617,7 @@
                 <w:b w:val="0"/>
                 <w:sz w:val="16"/>
               </w:rPr>
-              <w:t>60 min</w:t>
+              <w:t>75 min</w:t>
             </w:r>
           </w:p>
         </w:tc>
@@ -4312,7 +4637,7 @@
                 <w:b/>
                 <w:sz w:val="16"/>
               </w:rPr>
-              <w:t>Domain 5</w:t>
+              <w:t>Domain 4A</w:t>
             </w:r>
           </w:p>
         </w:tc>
@@ -4332,7 +4657,7 @@
                 <w:b w:val="0"/>
                 <w:sz w:val="16"/>
               </w:rPr>
-              <w:t>Xrefs, underlays, paths, comparison and emerging collaboration workflows.</w:t>
+              <w:t>Exam group 4.1: named page setups, layout viewports, clipping, scales, locks and annotation control.</w:t>
             </w:r>
           </w:p>
         </w:tc>
@@ -4352,7 +4677,112 @@
                 <w:b w:val="0"/>
                 <w:sz w:val="16"/>
               </w:rPr>
-              <w:t>Slides 62-69</w:t>
+              <w:t>Slides 258-270</w:t>
+            </w:r>
+          </w:p>
+        </w:tc>
+      </w:tr>
+      <w:tr>
+        <w:trPr>
+          <w:cantSplit/>
+        </w:trPr>
+        <w:tc>
+          <w:tcPr>
+            <w:tcW w:type="dxa" w:w="1296"/>
+            <w:vAlign w:val="center"/>
+          </w:tcPr>
+          <w:p>
+            <w:pPr>
+              <w:spacing w:after="40"/>
+            </w:pPr>
+            <w:r/>
+            <w:r>
+              <w:rPr>
+                <w:rFonts w:ascii="Arial" w:hAnsi="Arial"/>
+                <w:b w:val="0"/>
+                <w:sz w:val="16"/>
+              </w:rPr>
+              <w:t>14:30-15:15</w:t>
+            </w:r>
+          </w:p>
+        </w:tc>
+        <w:tc>
+          <w:tcPr>
+            <w:tcW w:type="dxa" w:w="936"/>
+            <w:vAlign w:val="center"/>
+          </w:tcPr>
+          <w:p>
+            <w:pPr>
+              <w:spacing w:after="40"/>
+            </w:pPr>
+            <w:r/>
+            <w:r>
+              <w:rPr>
+                <w:rFonts w:ascii="Arial" w:hAnsi="Arial"/>
+                <w:b w:val="0"/>
+                <w:sz w:val="16"/>
+              </w:rPr>
+              <w:t>45 min</w:t>
+            </w:r>
+          </w:p>
+        </w:tc>
+        <w:tc>
+          <w:tcPr>
+            <w:tcW w:type="dxa" w:w="1181"/>
+            <w:vAlign w:val="center"/>
+          </w:tcPr>
+          <w:p>
+            <w:pPr>
+              <w:spacing w:after="40"/>
+            </w:pPr>
+            <w:r/>
+            <w:r>
+              <w:rPr>
+                <w:rFonts w:ascii="Arial" w:hAnsi="Arial"/>
+                <w:b/>
+                <w:sz w:val="16"/>
+              </w:rPr>
+              <w:t>Lab 7</w:t>
+            </w:r>
+          </w:p>
+        </w:tc>
+        <w:tc>
+          <w:tcPr>
+            <w:tcW w:type="dxa" w:w="4032"/>
+            <w:vAlign w:val="center"/>
+          </w:tcPr>
+          <w:p>
+            <w:pPr>
+              <w:spacing w:after="40"/>
+            </w:pPr>
+            <w:r/>
+            <w:r>
+              <w:rPr>
+                <w:rFonts w:ascii="Arial" w:hAnsi="Arial"/>
+                <w:b w:val="0"/>
+                <w:sz w:val="16"/>
+              </w:rPr>
+              <w:t>Layouts, Viewports and Page Setups using the sink dataset.</w:t>
+            </w:r>
+          </w:p>
+        </w:tc>
+        <w:tc>
+          <w:tcPr>
+            <w:tcW w:type="dxa" w:w="1944"/>
+            <w:vAlign w:val="center"/>
+          </w:tcPr>
+          <w:p>
+            <w:pPr>
+              <w:spacing w:after="40"/>
+            </w:pPr>
+            <w:r/>
+            <w:r>
+              <w:rPr>
+                <w:rFonts w:ascii="Arial" w:hAnsi="Arial"/>
+                <w:b w:val="0"/>
+                <w:sz w:val="16"/>
+              </w:rPr>
+              <w:t>Slide 299 · Lab 7 · LG Lab 7</w:t>
             </w:r>
           </w:p>
         </w:tc>
@@ -4378,7 +4808,7 @@
                 <w:b w:val="0"/>
                 <w:sz w:val="16"/>
               </w:rPr>
-              <w:t>15:00-15:15</w:t>
+              <w:t>15:15-15:30</w:t>
             </w:r>
           </w:p>
         </w:tc>
@@ -4462,7 +4892,7 @@
                 <w:b w:val="0"/>
                 <w:sz w:val="16"/>
               </w:rPr>
-              <w:t>-</w:t>
+              <w:t>—</w:t>
             </w:r>
           </w:p>
         </w:tc>
@@ -4487,112 +4917,7 @@
                 <w:b w:val="0"/>
                 <w:sz w:val="16"/>
               </w:rPr>
-              <w:t>15:15-16:30</w:t>
-            </w:r>
-          </w:p>
-        </w:tc>
-        <w:tc>
-          <w:tcPr>
-            <w:tcW w:type="dxa" w:w="936"/>
-            <w:vAlign w:val="center"/>
-          </w:tcPr>
-          <w:p>
-            <w:pPr>
-              <w:spacing w:after="40"/>
-            </w:pPr>
-            <w:r/>
-            <w:r>
-              <w:rPr>
-                <w:rFonts w:ascii="Arial" w:hAnsi="Arial"/>
-                <w:b w:val="0"/>
-                <w:sz w:val="16"/>
-              </w:rPr>
-              <w:t>75 min</w:t>
-            </w:r>
-          </w:p>
-        </w:tc>
-        <w:tc>
-          <w:tcPr>
-            <w:tcW w:type="dxa" w:w="1181"/>
-            <w:vAlign w:val="center"/>
-          </w:tcPr>
-          <w:p>
-            <w:pPr>
-              <w:spacing w:after="40"/>
-            </w:pPr>
-            <w:r/>
-            <w:r>
-              <w:rPr>
-                <w:rFonts w:ascii="Arial" w:hAnsi="Arial"/>
-                <w:b/>
-                <w:sz w:val="16"/>
-              </w:rPr>
-              <w:t>Lab 9</w:t>
-            </w:r>
-          </w:p>
-        </w:tc>
-        <w:tc>
-          <w:tcPr>
-            <w:tcW w:type="dxa" w:w="4032"/>
-            <w:vAlign w:val="center"/>
-          </w:tcPr>
-          <w:p>
-            <w:pPr>
-              <w:spacing w:after="40"/>
-            </w:pPr>
-            <w:r/>
-            <w:r>
-              <w:rPr>
-                <w:rFonts w:ascii="Arial" w:hAnsi="Arial"/>
-                <w:b w:val="0"/>
-                <w:sz w:val="16"/>
-              </w:rPr>
-              <w:t>Xrefs, Underlays and Drawing Comparison.</w:t>
-            </w:r>
-          </w:p>
-        </w:tc>
-        <w:tc>
-          <w:tcPr>
-            <w:tcW w:type="dxa" w:w="1944"/>
-            <w:vAlign w:val="center"/>
-          </w:tcPr>
-          <w:p>
-            <w:pPr>
-              <w:spacing w:after="40"/>
-            </w:pPr>
-            <w:r/>
-            <w:r>
-              <w:rPr>
-                <w:rFonts w:ascii="Arial" w:hAnsi="Arial"/>
-                <w:b w:val="0"/>
-                <w:sz w:val="16"/>
-              </w:rPr>
-              <w:t>Slide 71 · Lab 9 · LG Lab 9</w:t>
-            </w:r>
-          </w:p>
-        </w:tc>
-      </w:tr>
-      <w:tr>
-        <w:trPr>
-          <w:cantSplit/>
-        </w:trPr>
-        <w:tc>
-          <w:tcPr>
-            <w:tcW w:type="dxa" w:w="1296"/>
-            <w:vAlign w:val="center"/>
-          </w:tcPr>
-          <w:p>
-            <w:pPr>
-              <w:spacing w:after="40"/>
-            </w:pPr>
-            <w:r/>
-            <w:r>
-              <w:rPr>
-                <w:rFonts w:ascii="Arial" w:hAnsi="Arial"/>
-                <w:b w:val="0"/>
-                <w:sz w:val="16"/>
-              </w:rPr>
-              <w:t>16:30-17:30</w:t>
+              <w:t>15:30-16:30</w:t>
             </w:r>
           </w:p>
         </w:tc>
@@ -4632,7 +4957,7 @@
                 <w:b/>
                 <w:sz w:val="16"/>
               </w:rPr>
-              <w:t>Capstone</w:t>
+              <w:t>Domain 4B</w:t>
             </w:r>
           </w:p>
         </w:tc>
@@ -4652,7 +4977,7 @@
                 <w:b w:val="0"/>
                 <w:sz w:val="16"/>
               </w:rPr>
-              <w:t>Brief the integrated sink-documentation problem and technology-selection scorecard.</w:t>
+              <w:t>Exam groups 4.2-4.3: publish lists, eTransmit, sheet creation, subsets and sheet-set properties.</w:t>
             </w:r>
           </w:p>
         </w:tc>
@@ -4672,7 +4997,7 @@
                 <w:b w:val="0"/>
                 <w:sz w:val="16"/>
               </w:rPr>
-              <w:t>Slides 70-72</w:t>
+              <w:t>Slides 271-288</w:t>
             </w:r>
           </w:p>
         </w:tc>
@@ -4697,7 +5022,7 @@
                 <w:b w:val="0"/>
                 <w:sz w:val="16"/>
               </w:rPr>
-              <w:t>17:30-18:00</w:t>
+              <w:t>16:30-17:15</w:t>
             </w:r>
           </w:p>
         </w:tc>
@@ -4717,7 +5042,7 @@
                 <w:b w:val="0"/>
                 <w:sz w:val="16"/>
               </w:rPr>
-              <w:t>30 min</w:t>
+              <w:t>45 min</w:t>
             </w:r>
           </w:p>
         </w:tc>
@@ -4737,7 +5062,7 @@
                 <w:b/>
                 <w:sz w:val="16"/>
               </w:rPr>
-              <w:t>Review</w:t>
+              <w:t>Lab 8</w:t>
             </w:r>
           </w:p>
         </w:tc>
@@ -4757,7 +5082,7 @@
                 <w:b w:val="0"/>
                 <w:sz w:val="16"/>
               </w:rPr>
-              <w:t>Dependency/path check, capstone plan, Day 3 recap and PM attendance.</w:t>
+              <w:t>Publish, Plot and eTransmit.</w:t>
             </w:r>
           </w:p>
         </w:tc>
@@ -4777,7 +5102,112 @@
                 <w:b w:val="0"/>
                 <w:sz w:val="16"/>
               </w:rPr>
-              <w:t>Lab 9-10 briefs</w:t>
+              <w:t>Slide 300 · Lab 8 · LG Lab 8</w:t>
+            </w:r>
+          </w:p>
+        </w:tc>
+      </w:tr>
+      <w:tr>
+        <w:trPr>
+          <w:cantSplit/>
+        </w:trPr>
+        <w:tc>
+          <w:tcPr>
+            <w:tcW w:type="dxa" w:w="1296"/>
+            <w:vAlign w:val="center"/>
+          </w:tcPr>
+          <w:p>
+            <w:pPr>
+              <w:spacing w:after="40"/>
+            </w:pPr>
+            <w:r/>
+            <w:r>
+              <w:rPr>
+                <w:rFonts w:ascii="Arial" w:hAnsi="Arial"/>
+                <w:b w:val="0"/>
+                <w:sz w:val="16"/>
+              </w:rPr>
+              <w:t>17:15-18:00</w:t>
+            </w:r>
+          </w:p>
+        </w:tc>
+        <w:tc>
+          <w:tcPr>
+            <w:tcW w:type="dxa" w:w="936"/>
+            <w:vAlign w:val="center"/>
+          </w:tcPr>
+          <w:p>
+            <w:pPr>
+              <w:spacing w:after="40"/>
+            </w:pPr>
+            <w:r/>
+            <w:r>
+              <w:rPr>
+                <w:rFonts w:ascii="Arial" w:hAnsi="Arial"/>
+                <w:b w:val="0"/>
+                <w:sz w:val="16"/>
+              </w:rPr>
+              <w:t>45 min</w:t>
+            </w:r>
+          </w:p>
+        </w:tc>
+        <w:tc>
+          <w:tcPr>
+            <w:tcW w:type="dxa" w:w="1181"/>
+            <w:vAlign w:val="center"/>
+          </w:tcPr>
+          <w:p>
+            <w:pPr>
+              <w:spacing w:after="40"/>
+            </w:pPr>
+            <w:r/>
+            <w:r>
+              <w:rPr>
+                <w:rFonts w:ascii="Arial" w:hAnsi="Arial"/>
+                <w:b/>
+                <w:sz w:val="16"/>
+              </w:rPr>
+              <w:t>Lab 15</w:t>
+            </w:r>
+          </w:p>
+        </w:tc>
+        <w:tc>
+          <w:tcPr>
+            <w:tcW w:type="dxa" w:w="4032"/>
+            <w:vAlign w:val="center"/>
+          </w:tcPr>
+          <w:p>
+            <w:pPr>
+              <w:spacing w:after="40"/>
+            </w:pPr>
+            <w:r/>
+            <w:r>
+              <w:rPr>
+                <w:rFonts w:ascii="Arial" w:hAnsi="Arial"/>
+                <w:b w:val="0"/>
+                <w:sz w:val="16"/>
+              </w:rPr>
+              <w:t>Named Page Setups, Sheet Sets and Batch Output.</w:t>
+            </w:r>
+          </w:p>
+        </w:tc>
+        <w:tc>
+          <w:tcPr>
+            <w:tcW w:type="dxa" w:w="1944"/>
+            <w:vAlign w:val="center"/>
+          </w:tcPr>
+          <w:p>
+            <w:pPr>
+              <w:spacing w:after="40"/>
+            </w:pPr>
+            <w:r/>
+            <w:r>
+              <w:rPr>
+                <w:rFonts w:ascii="Arial" w:hAnsi="Arial"/>
+                <w:b w:val="0"/>
+                <w:sz w:val="16"/>
+              </w:rPr>
+              <w:t>Slide 301 · Lab 15 · LG Lab 15</w:t>
             </w:r>
           </w:p>
         </w:tc>
@@ -4792,6 +5222,11 @@
       </w:r>
       <w:r>
         <w:t>480 contact minutes (8 hours), excluding lunch and including scheduled tea breaks.</w:t>
+      </w:r>
+    </w:p>
+    <w:p>
+      <w:r>
+        <w:br w:type="page"/>
       </w:r>
     </w:p>
     <w:p>
@@ -4927,7 +5362,7 @@
                 <w:color w:val="FFFFFF"/>
                 <w:sz w:val="17"/>
               </w:rPr>
-              <w:t>Resources</w:t>
+              <w:t>Slides</w:t>
             </w:r>
           </w:p>
         </w:tc>
@@ -5012,7 +5447,7 @@
                 <w:b w:val="0"/>
                 <w:sz w:val="16"/>
               </w:rPr>
-              <w:t>AM attendance and capstone readiness check.</w:t>
+              <w:t>AM attendance and Day 3 retrieval practice.</w:t>
             </w:r>
           </w:p>
         </w:tc>
@@ -5032,7 +5467,7 @@
                 <w:b w:val="0"/>
                 <w:sz w:val="16"/>
               </w:rPr>
-              <w:t>Lab 10 brief</w:t>
+              <w:t>Selected Day 3 slides</w:t>
             </w:r>
           </w:p>
         </w:tc>
@@ -5097,7 +5532,7 @@
                 <w:b/>
                 <w:sz w:val="16"/>
               </w:rPr>
-              <w:t>Lab 10</w:t>
+              <w:t>Domain 5A</w:t>
             </w:r>
           </w:p>
         </w:tc>
@@ -5117,7 +5552,7 @@
                 <w:b w:val="0"/>
                 <w:sz w:val="16"/>
               </w:rPr>
-              <w:t>Integrated Sink Documentation Capstone - planning, standards and sheet setup.</w:t>
+              <w:t>Exam groups 5.1-5.2: shared review, Traces, Compare, xref types, paths and underlay frames.</w:t>
             </w:r>
           </w:p>
         </w:tc>
@@ -5137,7 +5572,7 @@
                 <w:b w:val="0"/>
                 <w:sz w:val="16"/>
               </w:rPr>
-              <w:t>Slide 72 · Lab 10 · LG Lab 10</w:t>
+              <w:t>Slides 305-330</w:t>
             </w:r>
           </w:p>
         </w:tc>
@@ -5247,7 +5682,7 @@
                 <w:b w:val="0"/>
                 <w:sz w:val="16"/>
               </w:rPr>
-              <w:t>-</w:t>
+              <w:t>—</w:t>
             </w:r>
           </w:p>
         </w:tc>
@@ -5272,7 +5707,7 @@
                 <w:b w:val="0"/>
                 <w:sz w:val="16"/>
               </w:rPr>
-              <w:t>10:30-12:30</w:t>
+              <w:t>10:30-11:15</w:t>
             </w:r>
           </w:p>
         </w:tc>
@@ -5292,7 +5727,7 @@
                 <w:b w:val="0"/>
                 <w:sz w:val="16"/>
               </w:rPr>
-              <w:t>120 min</w:t>
+              <w:t>45 min</w:t>
             </w:r>
           </w:p>
         </w:tc>
@@ -5312,7 +5747,7 @@
                 <w:b/>
                 <w:sz w:val="16"/>
               </w:rPr>
-              <w:t>Lab 10</w:t>
+              <w:t>Lab 9</w:t>
             </w:r>
           </w:p>
         </w:tc>
@@ -5332,7 +5767,7 @@
                 <w:b w:val="0"/>
                 <w:sz w:val="16"/>
               </w:rPr>
-              <w:t>Capstone production - viewports, title blocks, component table, revision communication, publish and eTransmit.</w:t>
+              <w:t>Xrefs, Underlays and Drawing Comparison.</w:t>
             </w:r>
           </w:p>
         </w:tc>
@@ -5352,7 +5787,112 @@
                 <w:b w:val="0"/>
                 <w:sz w:val="16"/>
               </w:rPr>
-              <w:t>Lab 10 folder · recovered DWGs · detailed LG</w:t>
+              <w:t>Slide 353 · Lab 9 · LG Lab 9</w:t>
+            </w:r>
+          </w:p>
+        </w:tc>
+      </w:tr>
+      <w:tr>
+        <w:trPr>
+          <w:cantSplit/>
+        </w:trPr>
+        <w:tc>
+          <w:tcPr>
+            <w:tcW w:type="dxa" w:w="1296"/>
+            <w:vAlign w:val="center"/>
+          </w:tcPr>
+          <w:p>
+            <w:pPr>
+              <w:spacing w:after="40"/>
+            </w:pPr>
+            <w:r/>
+            <w:r>
+              <w:rPr>
+                <w:rFonts w:ascii="Arial" w:hAnsi="Arial"/>
+                <w:b w:val="0"/>
+                <w:sz w:val="16"/>
+              </w:rPr>
+              <w:t>11:15-12:15</w:t>
+            </w:r>
+          </w:p>
+        </w:tc>
+        <w:tc>
+          <w:tcPr>
+            <w:tcW w:type="dxa" w:w="936"/>
+            <w:vAlign w:val="center"/>
+          </w:tcPr>
+          <w:p>
+            <w:pPr>
+              <w:spacing w:after="40"/>
+            </w:pPr>
+            <w:r/>
+            <w:r>
+              <w:rPr>
+                <w:rFonts w:ascii="Arial" w:hAnsi="Arial"/>
+                <w:b w:val="0"/>
+                <w:sz w:val="16"/>
+              </w:rPr>
+              <w:t>60 min</w:t>
+            </w:r>
+          </w:p>
+        </w:tc>
+        <w:tc>
+          <w:tcPr>
+            <w:tcW w:type="dxa" w:w="1181"/>
+            <w:vAlign w:val="center"/>
+          </w:tcPr>
+          <w:p>
+            <w:pPr>
+              <w:spacing w:after="40"/>
+            </w:pPr>
+            <w:r/>
+            <w:r>
+              <w:rPr>
+                <w:rFonts w:ascii="Arial" w:hAnsi="Arial"/>
+                <w:b/>
+                <w:sz w:val="16"/>
+              </w:rPr>
+              <w:t>Domain 5B</w:t>
+            </w:r>
+          </w:p>
+        </w:tc>
+        <w:tc>
+          <w:tcPr>
+            <w:tcW w:type="dxa" w:w="4032"/>
+            <w:vAlign w:val="center"/>
+          </w:tcPr>
+          <w:p>
+            <w:pPr>
+              <w:spacing w:after="40"/>
+            </w:pPr>
+            <w:r/>
+            <w:r>
+              <w:rPr>
+                <w:rFonts w:ascii="Arial" w:hAnsi="Arial"/>
+                <w:b w:val="0"/>
+                <w:sz w:val="16"/>
+              </w:rPr>
+              <w:t>Exam group 5.3 and collaboration foundations: PDF imports, data links, fields and controlled handover.</w:t>
+            </w:r>
+          </w:p>
+        </w:tc>
+        <w:tc>
+          <w:tcPr>
+            <w:tcW w:type="dxa" w:w="1944"/>
+            <w:vAlign w:val="center"/>
+          </w:tcPr>
+          <w:p>
+            <w:pPr>
+              <w:spacing w:after="40"/>
+            </w:pPr>
+            <w:r/>
+            <w:r>
+              <w:rPr>
+                <w:rFonts w:ascii="Arial" w:hAnsi="Arial"/>
+                <w:b w:val="0"/>
+                <w:sz w:val="16"/>
+              </w:rPr>
+              <w:t>Slides 331-351</w:t>
             </w:r>
           </w:p>
         </w:tc>
@@ -5378,7 +5918,7 @@
                 <w:b w:val="0"/>
                 <w:sz w:val="16"/>
               </w:rPr>
-              <w:t>12:30-13:30</w:t>
+              <w:t>12:15-13:15</w:t>
             </w:r>
           </w:p>
         </w:tc>
@@ -5462,7 +6002,7 @@
                 <w:b w:val="0"/>
                 <w:sz w:val="16"/>
               </w:rPr>
-              <w:t>-</w:t>
+              <w:t>—</w:t>
             </w:r>
           </w:p>
         </w:tc>
@@ -5487,7 +6027,7 @@
                 <w:b w:val="0"/>
                 <w:sz w:val="16"/>
               </w:rPr>
-              <w:t>13:30-14:30</w:t>
+              <w:t>13:15-14:00</w:t>
             </w:r>
           </w:p>
         </w:tc>
@@ -5507,7 +6047,7 @@
                 <w:b w:val="0"/>
                 <w:sz w:val="16"/>
               </w:rPr>
-              <w:t>60 min</w:t>
+              <w:t>45 min</w:t>
             </w:r>
           </w:p>
         </w:tc>
@@ -5527,7 +6067,7 @@
                 <w:b/>
                 <w:sz w:val="16"/>
               </w:rPr>
-              <w:t>Review</w:t>
+              <w:t>Lab 16</w:t>
             </w:r>
           </w:p>
         </w:tc>
@@ -5547,7 +6087,7 @@
                 <w:b w:val="0"/>
                 <w:sz w:val="16"/>
               </w:rPr>
-              <w:t>Capstone evidence review, peer explanation and course summary.</w:t>
+              <w:t>Shared Review, References and Linked Data.</w:t>
             </w:r>
           </w:p>
         </w:tc>
@@ -5567,7 +6107,112 @@
                 <w:b w:val="0"/>
                 <w:sz w:val="16"/>
               </w:rPr>
-              <w:t>Slides 74-75</w:t>
+              <w:t>Slide 355 · Lab 16 · LG Lab 16</w:t>
+            </w:r>
+          </w:p>
+        </w:tc>
+      </w:tr>
+      <w:tr>
+        <w:trPr>
+          <w:cantSplit/>
+        </w:trPr>
+        <w:tc>
+          <w:tcPr>
+            <w:tcW w:type="dxa" w:w="1296"/>
+            <w:vAlign w:val="center"/>
+          </w:tcPr>
+          <w:p>
+            <w:pPr>
+              <w:spacing w:after="40"/>
+            </w:pPr>
+            <w:r/>
+            <w:r>
+              <w:rPr>
+                <w:rFonts w:ascii="Arial" w:hAnsi="Arial"/>
+                <w:b w:val="0"/>
+                <w:sz w:val="16"/>
+              </w:rPr>
+              <w:t>14:00-14:30</w:t>
+            </w:r>
+          </w:p>
+        </w:tc>
+        <w:tc>
+          <w:tcPr>
+            <w:tcW w:type="dxa" w:w="936"/>
+            <w:vAlign w:val="center"/>
+          </w:tcPr>
+          <w:p>
+            <w:pPr>
+              <w:spacing w:after="40"/>
+            </w:pPr>
+            <w:r/>
+            <w:r>
+              <w:rPr>
+                <w:rFonts w:ascii="Arial" w:hAnsi="Arial"/>
+                <w:b w:val="0"/>
+                <w:sz w:val="16"/>
+              </w:rPr>
+              <w:t>30 min</w:t>
+            </w:r>
+          </w:p>
+        </w:tc>
+        <w:tc>
+          <w:tcPr>
+            <w:tcW w:type="dxa" w:w="1181"/>
+            <w:vAlign w:val="center"/>
+          </w:tcPr>
+          <w:p>
+            <w:pPr>
+              <w:spacing w:after="40"/>
+            </w:pPr>
+            <w:r/>
+            <w:r>
+              <w:rPr>
+                <w:rFonts w:ascii="Arial" w:hAnsi="Arial"/>
+                <w:b/>
+                <w:sz w:val="16"/>
+              </w:rPr>
+              <w:t>Lab 10</w:t>
+            </w:r>
+          </w:p>
+        </w:tc>
+        <w:tc>
+          <w:tcPr>
+            <w:tcW w:type="dxa" w:w="4032"/>
+            <w:vAlign w:val="center"/>
+          </w:tcPr>
+          <w:p>
+            <w:pPr>
+              <w:spacing w:after="40"/>
+            </w:pPr>
+            <w:r/>
+            <w:r>
+              <w:rPr>
+                <w:rFonts w:ascii="Arial" w:hAnsi="Arial"/>
+                <w:b w:val="0"/>
+                <w:sz w:val="16"/>
+              </w:rPr>
+              <w:t>Integrated Sink Documentation Capstone readiness and evidence handover.</w:t>
+            </w:r>
+          </w:p>
+        </w:tc>
+        <w:tc>
+          <w:tcPr>
+            <w:tcW w:type="dxa" w:w="1944"/>
+            <w:vAlign w:val="center"/>
+          </w:tcPr>
+          <w:p>
+            <w:pPr>
+              <w:spacing w:after="40"/>
+            </w:pPr>
+            <w:r/>
+            <w:r>
+              <w:rPr>
+                <w:rFonts w:ascii="Arial" w:hAnsi="Arial"/>
+                <w:b w:val="0"/>
+                <w:sz w:val="16"/>
+              </w:rPr>
+              <w:t>Slide 354 · Lab 10 · LG Lab 10</w:t>
             </w:r>
           </w:p>
         </w:tc>
@@ -5677,7 +6322,7 @@
                 <w:b w:val="0"/>
                 <w:sz w:val="16"/>
               </w:rPr>
-              <w:t>-</w:t>
+              <w:t>—</w:t>
             </w:r>
           </w:p>
         </w:tc>
@@ -5766,7 +6411,7 @@
                 <w:b w:val="0"/>
                 <w:sz w:val="16"/>
               </w:rPr>
-              <w:t>Final assessment briefing and assessment digital attendance.</w:t>
+              <w:t>Course synthesis, final assessment briefing and assessment digital attendance.</w:t>
             </w:r>
           </w:p>
         </w:tc>
@@ -5787,7 +6432,7 @@
                 <w:b w:val="0"/>
                 <w:sz w:val="16"/>
               </w:rPr>
-              <w:t>Slides 15-16</w:t>
+              <w:t>Slides 357-16</w:t>
             </w:r>
           </w:p>
         </w:tc>
@@ -6037,7 +6682,7 @@
         <w:pStyle w:val="ListBullet"/>
       </w:pPr>
       <w:r>
-        <w:t>Domain 1 and Labs 1-2 -&gt; LO1-LO2 · K1-K2 · A1-A2.</w:t>
+        <w:t>Domain 1 and Labs 1, 2 and 11 -&gt; LO1-LO2 · K1-K2 · A1-A2.</w:t>
       </w:r>
     </w:p>
     <w:p>
@@ -6045,7 +6690,7 @@
         <w:pStyle w:val="ListBullet"/>
       </w:pPr>
       <w:r>
-        <w:t>Domain 2 and Labs 3-4 -&gt; LO3 · K3 · A3.</w:t>
+        <w:t>Domain 2 and Labs 3, 4 and 12 -&gt; LO3 · K3 · A3.</w:t>
       </w:r>
     </w:p>
     <w:p>
@@ -6053,7 +6698,7 @@
         <w:pStyle w:val="ListBullet"/>
       </w:pPr>
       <w:r>
-        <w:t>Domain 3 and Labs 5-6 -&gt; LO1-LO4 · K1, K2, K4 · A1, A2, A4.</w:t>
+        <w:t>Domain 3 and Labs 5, 6, 13 and 14 -&gt; LO1-LO4 · K1, K2, K4 · A1, A2, A4.</w:t>
       </w:r>
     </w:p>
     <w:p>
@@ -6061,7 +6706,7 @@
         <w:pStyle w:val="ListBullet"/>
       </w:pPr>
       <w:r>
-        <w:t>Domain 4 and Labs 7-8 -&gt; LO3-LO4 · K3, K4 · A1-A4.</w:t>
+        <w:t>Domain 4 and Labs 7, 8 and 15 -&gt; LO3-LO4 · K3, K4 · A1-A4.</w:t>
       </w:r>
     </w:p>
     <w:p>
@@ -6069,7 +6714,7 @@
         <w:pStyle w:val="ListBullet"/>
       </w:pPr>
       <w:r>
-        <w:t>Domain 5 and Labs 9-10 -&gt; LO1-LO5 · K1-K4 · A1-A5.</w:t>
+        <w:t>Domain 5 and Labs 9, 10 and 16 -&gt; LO1-LO5 · K1-K4 · A1-A5.</w:t>
       </w:r>
     </w:p>
     <w:p>

</xml_diff>